<commit_message>
feat: update week1 lab dock file for lecture prac
</commit_message>
<xml_diff>
--- a/Week1_lab/20260605072739_Week1_Linux_Lab_one_on_one.docx
+++ b/Week1_lab/20260605072739_Week1_Linux_Lab_one_on_one.docx
@@ -3359,6 +3359,7 @@
       <w:pPr>
         <w:pStyle w:val="16"/>
         <w:numPr>
+          <w:ilvl w:val="0"/>
           <w:numId w:val="0"/>
         </w:numPr>
         <w:spacing w:before="40" w:after="40"/>
@@ -3399,6 +3400,7 @@
       <w:pPr>
         <w:pStyle w:val="16"/>
         <w:numPr>
+          <w:ilvl w:val="0"/>
           <w:numId w:val="0"/>
         </w:numPr>
         <w:spacing w:before="40" w:after="40"/>
@@ -3439,6 +3441,7 @@
       <w:pPr>
         <w:pStyle w:val="16"/>
         <w:numPr>
+          <w:ilvl w:val="0"/>
           <w:numId w:val="0"/>
         </w:numPr>
         <w:spacing w:before="40" w:after="40"/>
@@ -3462,6 +3465,7 @@
       <w:pPr>
         <w:pStyle w:val="16"/>
         <w:numPr>
+          <w:ilvl w:val="0"/>
           <w:numId w:val="0"/>
         </w:numPr>
         <w:spacing w:before="40" w:after="40"/>
@@ -3502,6 +3506,7 @@
       <w:pPr>
         <w:pStyle w:val="16"/>
         <w:numPr>
+          <w:ilvl w:val="0"/>
           <w:numId w:val="0"/>
         </w:numPr>
         <w:spacing w:before="40" w:after="40"/>
@@ -3525,6 +3530,7 @@
       <w:pPr>
         <w:pStyle w:val="16"/>
         <w:numPr>
+          <w:ilvl w:val="0"/>
           <w:numId w:val="0"/>
         </w:numPr>
         <w:spacing w:before="40" w:after="40"/>
@@ -3565,6 +3571,7 @@
       <w:pPr>
         <w:pStyle w:val="16"/>
         <w:numPr>
+          <w:ilvl w:val="0"/>
           <w:numId w:val="0"/>
         </w:numPr>
         <w:spacing w:before="40" w:after="40"/>
@@ -3605,6 +3612,7 @@
       <w:pPr>
         <w:pStyle w:val="16"/>
         <w:numPr>
+          <w:ilvl w:val="0"/>
           <w:numId w:val="0"/>
         </w:numPr>
         <w:spacing w:before="40" w:after="40"/>
@@ -3645,6 +3653,7 @@
       <w:pPr>
         <w:pStyle w:val="16"/>
         <w:numPr>
+          <w:ilvl w:val="0"/>
           <w:numId w:val="0"/>
         </w:numPr>
         <w:spacing w:before="40" w:after="40"/>
@@ -3668,6 +3677,7 @@
       <w:pPr>
         <w:pStyle w:val="16"/>
         <w:numPr>
+          <w:ilvl w:val="0"/>
           <w:numId w:val="0"/>
         </w:numPr>
         <w:spacing w:before="40" w:after="40"/>
@@ -3708,6 +3718,7 @@
       <w:pPr>
         <w:pStyle w:val="16"/>
         <w:numPr>
+          <w:ilvl w:val="0"/>
           <w:numId w:val="0"/>
         </w:numPr>
         <w:spacing w:before="40" w:after="40"/>
@@ -3748,6 +3759,7 @@
       <w:pPr>
         <w:pStyle w:val="16"/>
         <w:numPr>
+          <w:ilvl w:val="0"/>
           <w:numId w:val="0"/>
         </w:numPr>
         <w:spacing w:before="40" w:after="40"/>
@@ -3771,6 +3783,7 @@
       <w:pPr>
         <w:pStyle w:val="16"/>
         <w:numPr>
+          <w:ilvl w:val="0"/>
           <w:numId w:val="0"/>
         </w:numPr>
         <w:spacing w:before="40" w:after="40"/>
@@ -3811,6 +3824,7 @@
       <w:pPr>
         <w:pStyle w:val="16"/>
         <w:numPr>
+          <w:ilvl w:val="0"/>
           <w:numId w:val="0"/>
         </w:numPr>
         <w:spacing w:before="40" w:after="40"/>
@@ -3851,6 +3865,7 @@
       <w:pPr>
         <w:pStyle w:val="16"/>
         <w:numPr>
+          <w:ilvl w:val="0"/>
           <w:numId w:val="0"/>
         </w:numPr>
         <w:spacing w:before="40" w:after="40"/>
@@ -3874,6 +3889,7 @@
       <w:pPr>
         <w:pStyle w:val="16"/>
         <w:numPr>
+          <w:ilvl w:val="0"/>
           <w:numId w:val="0"/>
         </w:numPr>
         <w:spacing w:before="40" w:after="40"/>
@@ -3914,6 +3930,7 @@
       <w:pPr>
         <w:pStyle w:val="16"/>
         <w:numPr>
+          <w:ilvl w:val="0"/>
           <w:numId w:val="0"/>
         </w:numPr>
         <w:spacing w:before="40" w:after="40"/>
@@ -4057,6 +4074,7 @@
       <w:pPr>
         <w:pStyle w:val="16"/>
         <w:numPr>
+          <w:ilvl w:val="0"/>
           <w:numId w:val="0"/>
         </w:numPr>
         <w:spacing w:before="40" w:after="40"/>
@@ -4099,6 +4117,7 @@
       <w:pPr>
         <w:pStyle w:val="16"/>
         <w:numPr>
+          <w:ilvl w:val="0"/>
           <w:numId w:val="0"/>
         </w:numPr>
         <w:spacing w:before="40" w:after="40"/>
@@ -4142,6 +4161,7 @@
       <w:pPr>
         <w:pStyle w:val="16"/>
         <w:numPr>
+          <w:ilvl w:val="0"/>
           <w:numId w:val="0"/>
         </w:numPr>
         <w:spacing w:before="40" w:after="40"/>
@@ -4185,6 +4205,7 @@
       <w:pPr>
         <w:pStyle w:val="16"/>
         <w:numPr>
+          <w:ilvl w:val="0"/>
           <w:numId w:val="0"/>
         </w:numPr>
         <w:spacing w:before="40" w:after="40"/>
@@ -4228,6 +4249,7 @@
       <w:pPr>
         <w:pStyle w:val="16"/>
         <w:numPr>
+          <w:ilvl w:val="0"/>
           <w:numId w:val="0"/>
         </w:numPr>
         <w:spacing w:before="40" w:after="40"/>
@@ -4357,6 +4379,7 @@
       <w:pPr>
         <w:pStyle w:val="16"/>
         <w:numPr>
+          <w:ilvl w:val="0"/>
           <w:numId w:val="0"/>
         </w:numPr>
         <w:spacing w:before="40" w:after="40"/>
@@ -4400,6 +4423,7 @@
       <w:pPr>
         <w:pStyle w:val="16"/>
         <w:numPr>
+          <w:ilvl w:val="0"/>
           <w:numId w:val="0"/>
         </w:numPr>
         <w:spacing w:before="40" w:after="40"/>
@@ -4443,6 +4467,7 @@
       <w:pPr>
         <w:pStyle w:val="16"/>
         <w:numPr>
+          <w:ilvl w:val="0"/>
           <w:numId w:val="0"/>
         </w:numPr>
         <w:spacing w:before="40" w:after="40"/>
@@ -4548,6 +4573,7 @@
       <w:pPr>
         <w:pStyle w:val="16"/>
         <w:numPr>
+          <w:ilvl w:val="0"/>
           <w:numId w:val="0"/>
         </w:numPr>
         <w:spacing w:before="40" w:after="40"/>
@@ -4653,6 +4679,7 @@
       <w:pPr>
         <w:pStyle w:val="16"/>
         <w:numPr>
+          <w:ilvl w:val="0"/>
           <w:numId w:val="0"/>
         </w:numPr>
         <w:spacing w:before="40" w:after="40"/>
@@ -4740,6 +4767,7 @@
       <w:pPr>
         <w:pStyle w:val="16"/>
         <w:numPr>
+          <w:ilvl w:val="0"/>
           <w:numId w:val="0"/>
         </w:numPr>
         <w:spacing w:before="40" w:after="40"/>
@@ -4853,6 +4881,7 @@
       <w:pPr>
         <w:pStyle w:val="16"/>
         <w:numPr>
+          <w:ilvl w:val="0"/>
           <w:numId w:val="0"/>
         </w:numPr>
         <w:spacing w:before="40" w:after="40"/>
@@ -4922,6 +4951,7 @@
       <w:pPr>
         <w:pStyle w:val="16"/>
         <w:numPr>
+          <w:ilvl w:val="0"/>
           <w:numId w:val="0"/>
         </w:numPr>
         <w:spacing w:before="40" w:after="40"/>
@@ -5035,6 +5065,7 @@
       <w:pPr>
         <w:pStyle w:val="16"/>
         <w:numPr>
+          <w:ilvl w:val="0"/>
           <w:numId w:val="0"/>
         </w:numPr>
         <w:spacing w:before="40" w:after="40"/>
@@ -5346,6 +5377,7 @@
       <w:pPr>
         <w:pStyle w:val="16"/>
         <w:numPr>
+          <w:ilvl w:val="0"/>
           <w:numId w:val="0"/>
         </w:numPr>
         <w:spacing w:before="40" w:after="40"/>
@@ -5389,6 +5421,7 @@
       <w:pPr>
         <w:pStyle w:val="16"/>
         <w:numPr>
+          <w:ilvl w:val="0"/>
           <w:numId w:val="0"/>
         </w:numPr>
         <w:spacing w:before="40" w:after="40"/>
@@ -5847,6 +5880,7 @@
       <w:pPr>
         <w:pStyle w:val="16"/>
         <w:numPr>
+          <w:ilvl w:val="0"/>
           <w:numId w:val="0"/>
         </w:numPr>
         <w:spacing w:before="40" w:after="40"/>
@@ -6107,6 +6141,7 @@
     <w:p>
       <w:pPr>
         <w:numPr>
+          <w:ilvl w:val="0"/>
           <w:numId w:val="0"/>
         </w:numPr>
         <w:spacing w:before="120" w:after="100"/>
@@ -6199,24 +6234,14 @@
           <w:sz w:val="20"/>
           <w:szCs w:val="20"/>
         </w:rPr>
-        <w:t>Before deleting any log file, check whether a running process has it open. Write the command. Explain what happens on Linux if you rm a file a pr</w:t>
-      </w:r>
-      <w:bookmarkStart w:id="0" w:name="_GoBack"/>
-      <w:bookmarkEnd w:id="0"/>
-      <w:r>
-        <w:rPr>
-          <w:rFonts w:ascii="Calibri" w:hAnsi="Calibri" w:eastAsia="Calibri" w:cs="Calibri"/>
-          <w:color w:val="2D2D2D"/>
-          <w:sz w:val="20"/>
-          <w:szCs w:val="20"/>
-        </w:rPr>
-        <w:t>ocess has open. Explain what you do instead and why.</w:t>
+        <w:t>Before deleting any log file, check whether a running process has it open. Write the command. Explain what happens on Linux if you rm a file a process has open. Explain what you do instead and why.</w:t>
       </w:r>
     </w:p>
     <w:p>
       <w:pPr>
         <w:pStyle w:val="16"/>
         <w:numPr>
+          <w:ilvl w:val="0"/>
           <w:numId w:val="0"/>
         </w:numPr>
         <w:spacing w:before="40" w:after="40"/>
@@ -6279,6 +6304,7 @@
       <w:pPr>
         <w:pStyle w:val="16"/>
         <w:numPr>
+          <w:ilvl w:val="0"/>
           <w:numId w:val="0"/>
         </w:numPr>
         <w:spacing w:before="40" w:after="40"/>
@@ -6357,6 +6383,7 @@
       <w:pPr>
         <w:pStyle w:val="16"/>
         <w:numPr>
+          <w:ilvl w:val="0"/>
           <w:numId w:val="0"/>
         </w:numPr>
         <w:spacing w:before="40" w:after="40"/>
@@ -6483,6 +6510,7 @@
       <w:pPr>
         <w:pStyle w:val="16"/>
         <w:numPr>
+          <w:ilvl w:val="0"/>
           <w:numId w:val="0"/>
         </w:numPr>
         <w:spacing w:before="40" w:after="40"/>
@@ -6522,6 +6550,7 @@
       <w:pPr>
         <w:pStyle w:val="16"/>
         <w:numPr>
+          <w:ilvl w:val="0"/>
           <w:numId w:val="0"/>
         </w:numPr>
         <w:spacing w:before="40" w:after="40"/>
@@ -6633,6 +6662,7 @@
       <w:pPr>
         <w:pStyle w:val="16"/>
         <w:numPr>
+          <w:ilvl w:val="0"/>
           <w:numId w:val="0"/>
         </w:numPr>
         <w:spacing w:before="40" w:after="40"/>
@@ -6808,6 +6838,7 @@
       <w:pPr>
         <w:pStyle w:val="16"/>
         <w:numPr>
+          <w:ilvl w:val="0"/>
           <w:numId w:val="0"/>
         </w:numPr>
         <w:spacing w:before="40" w:after="40"/>
@@ -6887,6 +6918,7 @@
       <w:pPr>
         <w:pStyle w:val="16"/>
         <w:numPr>
+          <w:ilvl w:val="0"/>
           <w:numId w:val="0"/>
         </w:numPr>
         <w:spacing w:before="40" w:after="40"/>
@@ -6910,6 +6942,7 @@
       <w:pPr>
         <w:pStyle w:val="16"/>
         <w:numPr>
+          <w:ilvl w:val="0"/>
           <w:numId w:val="0"/>
         </w:numPr>
         <w:spacing w:before="40" w:after="40"/>
@@ -7945,6 +7978,7 @@
     <w:p>
       <w:pPr>
         <w:numPr>
+          <w:ilvl w:val="0"/>
           <w:numId w:val="0"/>
         </w:numPr>
         <w:spacing w:before="60" w:after="60"/>
@@ -8117,6 +8151,7 @@
       <w:pPr>
         <w:pStyle w:val="16"/>
         <w:numPr>
+          <w:ilvl w:val="0"/>
           <w:numId w:val="0"/>
         </w:numPr>
         <w:spacing w:before="40" w:after="40"/>
@@ -8127,6 +8162,7 @@
       <w:pPr>
         <w:pStyle w:val="16"/>
         <w:numPr>
+          <w:ilvl w:val="0"/>
           <w:numId w:val="0"/>
         </w:numPr>
         <w:spacing w:before="40" w:after="40"/>
@@ -8137,6 +8173,7 @@
       <w:pPr>
         <w:pStyle w:val="16"/>
         <w:numPr>
+          <w:ilvl w:val="0"/>
           <w:numId w:val="0"/>
         </w:numPr>
         <w:spacing w:before="40" w:after="40"/>
@@ -8190,6 +8227,7 @@
       <w:pPr>
         <w:pStyle w:val="16"/>
         <w:numPr>
+          <w:ilvl w:val="0"/>
           <w:numId w:val="0"/>
         </w:numPr>
         <w:spacing w:before="40" w:after="40"/>
@@ -8246,6 +8284,7 @@
       <w:pPr>
         <w:pStyle w:val="16"/>
         <w:numPr>
+          <w:ilvl w:val="0"/>
           <w:numId w:val="0"/>
         </w:numPr>
         <w:spacing w:before="40" w:after="40"/>
@@ -8308,6 +8347,7 @@
       <w:pPr>
         <w:pStyle w:val="16"/>
         <w:numPr>
+          <w:ilvl w:val="0"/>
           <w:numId w:val="0"/>
         </w:numPr>
         <w:spacing w:before="40" w:after="40"/>
@@ -8376,6 +8416,7 @@
       <w:pPr>
         <w:pStyle w:val="16"/>
         <w:numPr>
+          <w:ilvl w:val="0"/>
           <w:numId w:val="0"/>
         </w:numPr>
         <w:spacing w:before="40" w:after="40"/>
@@ -8401,6 +8442,7 @@
       <w:pPr>
         <w:pStyle w:val="16"/>
         <w:numPr>
+          <w:ilvl w:val="0"/>
           <w:numId w:val="0"/>
         </w:numPr>
         <w:spacing w:before="40" w:after="40"/>
@@ -8442,6 +8484,7 @@
       <w:pPr>
         <w:pStyle w:val="16"/>
         <w:numPr>
+          <w:ilvl w:val="0"/>
           <w:numId w:val="0"/>
         </w:numPr>
         <w:spacing w:before="40" w:after="40"/>
@@ -8458,6 +8501,7 @@
       <w:pPr>
         <w:pStyle w:val="16"/>
         <w:numPr>
+          <w:ilvl w:val="0"/>
           <w:numId w:val="0"/>
         </w:numPr>
         <w:spacing w:before="40" w:after="40"/>
@@ -8496,6 +8540,9 @@
           <w:ilvl w:val="1"/>
           <w:numId w:val="6"/>
         </w:numPr>
+        <w:tabs>
+          <w:tab w:val="left" w:pos="840"/>
+        </w:tabs>
         <w:spacing w:before="40" w:after="40"/>
         <w:ind w:left="1080" w:leftChars="0" w:hanging="420" w:firstLineChars="0"/>
         <w:rPr>
@@ -8534,6 +8581,9 @@
           <w:ilvl w:val="1"/>
           <w:numId w:val="6"/>
         </w:numPr>
+        <w:tabs>
+          <w:tab w:val="left" w:pos="840"/>
+        </w:tabs>
         <w:spacing w:before="40" w:after="40"/>
         <w:ind w:left="1080" w:leftChars="0" w:hanging="420" w:firstLineChars="0"/>
         <w:rPr>
@@ -8588,6 +8638,9 @@
           <w:ilvl w:val="1"/>
           <w:numId w:val="6"/>
         </w:numPr>
+        <w:tabs>
+          <w:tab w:val="left" w:pos="840"/>
+        </w:tabs>
         <w:spacing w:before="40" w:after="40"/>
         <w:ind w:left="1080" w:leftChars="0" w:hanging="420" w:firstLineChars="0"/>
         <w:rPr>
@@ -8622,6 +8675,7 @@
       <w:pPr>
         <w:pStyle w:val="16"/>
         <w:numPr>
+          <w:ilvl w:val="0"/>
           <w:numId w:val="0"/>
         </w:numPr>
         <w:spacing w:before="40" w:after="40"/>
@@ -8659,6 +8713,7 @@
       <w:pPr>
         <w:pStyle w:val="16"/>
         <w:numPr>
+          <w:ilvl w:val="0"/>
           <w:numId w:val="0"/>
         </w:numPr>
         <w:spacing w:before="40" w:after="40"/>
@@ -8695,6 +8750,7 @@
       <w:pPr>
         <w:pStyle w:val="16"/>
         <w:numPr>
+          <w:ilvl w:val="0"/>
           <w:numId w:val="0"/>
         </w:numPr>
         <w:spacing w:before="40" w:after="40"/>
@@ -8767,6 +8823,7 @@
       <w:pPr>
         <w:pStyle w:val="16"/>
         <w:numPr>
+          <w:ilvl w:val="0"/>
           <w:numId w:val="0"/>
         </w:numPr>
         <w:spacing w:before="40" w:after="40"/>
@@ -8804,6 +8861,7 @@
       <w:pPr>
         <w:pStyle w:val="16"/>
         <w:numPr>
+          <w:ilvl w:val="0"/>
           <w:numId w:val="0"/>
         </w:numPr>
         <w:spacing w:before="40" w:after="40"/>
@@ -8841,6 +8899,7 @@
       <w:pPr>
         <w:pStyle w:val="16"/>
         <w:numPr>
+          <w:ilvl w:val="0"/>
           <w:numId w:val="0"/>
         </w:numPr>
         <w:spacing w:before="40" w:after="40"/>
@@ -9252,6 +9311,7 @@
       <w:pPr>
         <w:pStyle w:val="16"/>
         <w:numPr>
+          <w:ilvl w:val="0"/>
           <w:numId w:val="0"/>
         </w:numPr>
         <w:spacing w:before="40" w:after="40"/>
@@ -10357,7 +10417,7 @@
     <w:p>
       <w:pPr>
         <w:spacing w:before="160"/>
-        <w:jc w:val="center"/>
+        <w:jc w:val="both"/>
         <w:rPr>
           <w:rFonts w:hint="default"/>
           <w:color w:val="558ED5" w:themeColor="text2" w:themeTint="99"/>
@@ -10372,6 +10432,277 @@
           </w14:textFill>
         </w:rPr>
       </w:pPr>
+    </w:p>
+    <w:p>
+      <w:pPr>
+        <w:spacing w:before="160"/>
+        <w:jc w:val="both"/>
+        <w:rPr>
+          <w:rFonts w:hint="default" w:eastAsia="宋体"/>
+          <w:color w:val="558ED5" w:themeColor="text2" w:themeTint="99"/>
+          <w:lang w:val="en-US" w:eastAsia="zh-CN"/>
+          <w14:textFill>
+            <w14:solidFill>
+              <w14:schemeClr w14:val="tx2">
+                <w14:lumMod w14:val="60000"/>
+                <w14:lumOff w14:val="40000"/>
+              </w14:schemeClr>
+            </w14:solidFill>
+          </w14:textFill>
+        </w:rPr>
+      </w:pPr>
+      <w:r>
+        <w:rPr>
+          <w:rFonts w:hint="default" w:eastAsia="宋体"/>
+          <w:color w:val="558ED5" w:themeColor="text2" w:themeTint="99"/>
+          <w:lang w:val="en-US" w:eastAsia="zh-CN"/>
+          <w14:textFill>
+            <w14:solidFill>
+              <w14:schemeClr w14:val="tx2">
+                <w14:lumMod w14:val="60000"/>
+                <w14:lumOff w14:val="40000"/>
+              </w14:schemeClr>
+            </w14:solidFill>
+          </w14:textFill>
+        </w:rPr>
+        <w:t>LAB</w:t>
+      </w:r>
+    </w:p>
+    <w:p>
+      <w:pPr>
+        <w:spacing w:before="160"/>
+        <w:jc w:val="both"/>
+      </w:pPr>
+      <w:r>
+        <w:drawing>
+          <wp:inline distT="0" distB="0" distL="114300" distR="114300">
+            <wp:extent cx="3933825" cy="1381125"/>
+            <wp:effectExtent l="0" t="0" r="3175" b="15875"/>
+            <wp:docPr id="2" name="图片 1"/>
+            <wp:cNvGraphicFramePr>
+              <a:graphicFrameLocks xmlns:a="http://schemas.openxmlformats.org/drawingml/2006/main" noChangeAspect="1"/>
+            </wp:cNvGraphicFramePr>
+            <a:graphic xmlns:a="http://schemas.openxmlformats.org/drawingml/2006/main">
+              <a:graphicData uri="http://schemas.openxmlformats.org/drawingml/2006/picture">
+                <pic:pic xmlns:pic="http://schemas.openxmlformats.org/drawingml/2006/picture">
+                  <pic:nvPicPr>
+                    <pic:cNvPr id="2" name="图片 1"/>
+                    <pic:cNvPicPr>
+                      <a:picLocks noChangeAspect="1"/>
+                    </pic:cNvPicPr>
+                  </pic:nvPicPr>
+                  <pic:blipFill>
+                    <a:blip r:embed="rId15"/>
+                    <a:stretch>
+                      <a:fillRect/>
+                    </a:stretch>
+                  </pic:blipFill>
+                  <pic:spPr>
+                    <a:xfrm>
+                      <a:off x="0" y="0"/>
+                      <a:ext cx="3933825" cy="1381125"/>
+                    </a:xfrm>
+                    <a:prstGeom prst="rect">
+                      <a:avLst/>
+                    </a:prstGeom>
+                    <a:noFill/>
+                    <a:ln>
+                      <a:noFill/>
+                    </a:ln>
+                  </pic:spPr>
+                </pic:pic>
+              </a:graphicData>
+            </a:graphic>
+          </wp:inline>
+        </w:drawing>
+      </w:r>
+    </w:p>
+    <w:p>
+      <w:pPr>
+        <w:spacing w:before="160"/>
+        <w:jc w:val="both"/>
+        <w:rPr>
+          <w:rFonts w:hint="default"/>
+          <w:lang w:val="en-US" w:eastAsia="zh-CN"/>
+        </w:rPr>
+      </w:pPr>
+      <w:r>
+        <w:rPr>
+          <w:rFonts w:hint="default"/>
+          <w:lang w:val="en-US" w:eastAsia="zh-CN"/>
+        </w:rPr>
+        <w:t>cd class_lab</w:t>
+      </w:r>
+    </w:p>
+    <w:p>
+      <w:pPr>
+        <w:spacing w:before="160"/>
+        <w:jc w:val="both"/>
+        <w:rPr>
+          <w:rFonts w:hint="default"/>
+          <w:lang w:val="en-US" w:eastAsia="zh-CN"/>
+        </w:rPr>
+      </w:pPr>
+      <w:r>
+        <w:rPr>
+          <w:rFonts w:hint="default"/>
+          <w:lang w:val="en-US" w:eastAsia="zh-CN"/>
+        </w:rPr>
+        <w:t>mkdir -p logs</w:t>
+      </w:r>
+    </w:p>
+    <w:p>
+      <w:pPr>
+        <w:spacing w:before="160"/>
+        <w:jc w:val="both"/>
+        <w:rPr>
+          <w:rFonts w:hint="default"/>
+          <w:lang w:val="en-US" w:eastAsia="zh-CN"/>
+        </w:rPr>
+      </w:pPr>
+      <w:r>
+        <w:rPr>
+          <w:rFonts w:hint="default"/>
+          <w:lang w:val="en-US" w:eastAsia="zh-CN"/>
+        </w:rPr>
+        <w:t>mkdir -p scripts</w:t>
+      </w:r>
+    </w:p>
+    <w:p>
+      <w:pPr>
+        <w:spacing w:before="160"/>
+        <w:jc w:val="both"/>
+        <w:rPr>
+          <w:rFonts w:hint="default"/>
+          <w:lang w:val="en-US" w:eastAsia="zh-CN"/>
+        </w:rPr>
+      </w:pPr>
+      <w:r>
+        <w:rPr>
+          <w:rFonts w:hint="default"/>
+          <w:lang w:val="en-US" w:eastAsia="zh-CN"/>
+        </w:rPr>
+        <w:t>mkdir -p configs</w:t>
+      </w:r>
+    </w:p>
+    <w:p>
+      <w:pPr>
+        <w:spacing w:before="160"/>
+        <w:jc w:val="both"/>
+        <w:rPr>
+          <w:rFonts w:hint="default"/>
+          <w:lang w:val="en-US" w:eastAsia="zh-CN"/>
+        </w:rPr>
+      </w:pPr>
+      <w:r>
+        <w:rPr>
+          <w:rFonts w:hint="default"/>
+          <w:lang w:val="en-US" w:eastAsia="zh-CN"/>
+        </w:rPr>
+        <w:t>touch logs/app.log</w:t>
+      </w:r>
+    </w:p>
+    <w:p>
+      <w:pPr>
+        <w:spacing w:before="160"/>
+        <w:jc w:val="both"/>
+        <w:rPr>
+          <w:rFonts w:hint="default"/>
+          <w:lang w:val="en-US" w:eastAsia="zh-CN"/>
+        </w:rPr>
+      </w:pPr>
+      <w:r>
+        <w:rPr>
+          <w:rFonts w:hint="default"/>
+          <w:lang w:val="en-US" w:eastAsia="zh-CN"/>
+        </w:rPr>
+        <w:t>echo "INFO: this is prac info" &gt;&gt; logs/app.log</w:t>
+      </w:r>
+    </w:p>
+    <w:p>
+      <w:pPr>
+        <w:spacing w:before="160"/>
+        <w:jc w:val="both"/>
+        <w:rPr>
+          <w:rFonts w:hint="default"/>
+          <w:lang w:val="en-US" w:eastAsia="zh-CN"/>
+        </w:rPr>
+      </w:pPr>
+      <w:r>
+        <w:rPr>
+          <w:rFonts w:hint="default"/>
+          <w:lang w:val="en-US" w:eastAsia="zh-CN"/>
+        </w:rPr>
+        <w:t>echo "ERROR: this is prac error" &gt;&gt; logs/app.log</w:t>
+      </w:r>
+    </w:p>
+    <w:p>
+      <w:pPr>
+        <w:spacing w:before="160"/>
+        <w:jc w:val="both"/>
+        <w:rPr>
+          <w:rFonts w:hint="default"/>
+          <w:lang w:val="en-US" w:eastAsia="zh-CN"/>
+        </w:rPr>
+      </w:pPr>
+      <w:r>
+        <w:rPr>
+          <w:rFonts w:hint="default"/>
+          <w:lang w:val="en-US" w:eastAsia="zh-CN"/>
+        </w:rPr>
+        <w:t>echo "ERROR: this is the second prac error" &gt;&gt; logs/app.log</w:t>
+      </w:r>
+    </w:p>
+    <w:p>
+      <w:pPr>
+        <w:spacing w:before="160"/>
+        <w:jc w:val="both"/>
+        <w:rPr>
+          <w:rFonts w:hint="default"/>
+          <w:lang w:val="en-US" w:eastAsia="zh-CN"/>
+        </w:rPr>
+      </w:pPr>
+      <w:r>
+        <w:rPr>
+          <w:rFonts w:hint="default"/>
+          <w:lang w:val="en-US" w:eastAsia="zh-CN"/>
+        </w:rPr>
+        <w:t xml:space="preserve">cat logs/app.log|grep "ERROR" </w:t>
+      </w:r>
+    </w:p>
+    <w:p>
+      <w:pPr>
+        <w:spacing w:before="160"/>
+        <w:jc w:val="both"/>
+        <w:rPr>
+          <w:rFonts w:hint="default"/>
+          <w:lang w:val="en-US" w:eastAsia="zh-CN"/>
+        </w:rPr>
+      </w:pPr>
+      <w:r>
+        <w:rPr>
+          <w:rFonts w:hint="default"/>
+          <w:lang w:val="en-US" w:eastAsia="zh-CN"/>
+        </w:rPr>
+        <w:t>cp logs/app.log configs</w:t>
+      </w:r>
+    </w:p>
+    <w:p>
+      <w:pPr>
+        <w:spacing w:before="160"/>
+        <w:jc w:val="both"/>
+        <w:rPr>
+          <w:rFonts w:hint="default"/>
+          <w:lang w:val="en-US" w:eastAsia="zh-CN"/>
+        </w:rPr>
+      </w:pPr>
+      <w:r>
+        <w:rPr>
+          <w:rFonts w:hint="default"/>
+          <w:lang w:val="en-US" w:eastAsia="zh-CN"/>
+        </w:rPr>
+        <w:t>rm -r logs/app.log</w:t>
+      </w:r>
     </w:p>
     <w:p>
       <w:pPr>
@@ -10391,23 +10722,870 @@
           </w14:textFill>
         </w:rPr>
       </w:pPr>
+      <w:bookmarkStart w:id="0" w:name="_GoBack"/>
+      <w:bookmarkEnd w:id="0"/>
+    </w:p>
+    <w:p>
+      <w:pPr>
+        <w:spacing w:before="160"/>
+        <w:jc w:val="both"/>
+      </w:pPr>
+      <w:r>
+        <w:drawing>
+          <wp:inline distT="0" distB="0" distL="114300" distR="114300">
+            <wp:extent cx="3095625" cy="1400175"/>
+            <wp:effectExtent l="0" t="0" r="3175" b="22225"/>
+            <wp:docPr id="3" name="图片 2"/>
+            <wp:cNvGraphicFramePr>
+              <a:graphicFrameLocks xmlns:a="http://schemas.openxmlformats.org/drawingml/2006/main" noChangeAspect="1"/>
+            </wp:cNvGraphicFramePr>
+            <a:graphic xmlns:a="http://schemas.openxmlformats.org/drawingml/2006/main">
+              <a:graphicData uri="http://schemas.openxmlformats.org/drawingml/2006/picture">
+                <pic:pic xmlns:pic="http://schemas.openxmlformats.org/drawingml/2006/picture">
+                  <pic:nvPicPr>
+                    <pic:cNvPr id="3" name="图片 2"/>
+                    <pic:cNvPicPr>
+                      <a:picLocks noChangeAspect="1"/>
+                    </pic:cNvPicPr>
+                  </pic:nvPicPr>
+                  <pic:blipFill>
+                    <a:blip r:embed="rId16"/>
+                    <a:stretch>
+                      <a:fillRect/>
+                    </a:stretch>
+                  </pic:blipFill>
+                  <pic:spPr>
+                    <a:xfrm>
+                      <a:off x="0" y="0"/>
+                      <a:ext cx="3095625" cy="1400175"/>
+                    </a:xfrm>
+                    <a:prstGeom prst="rect">
+                      <a:avLst/>
+                    </a:prstGeom>
+                    <a:noFill/>
+                    <a:ln>
+                      <a:noFill/>
+                    </a:ln>
+                  </pic:spPr>
+                </pic:pic>
+              </a:graphicData>
+            </a:graphic>
+          </wp:inline>
+        </w:drawing>
+      </w:r>
+    </w:p>
+    <w:p>
+      <w:pPr>
+        <w:spacing w:before="160"/>
+        <w:jc w:val="both"/>
+      </w:pPr>
+    </w:p>
+    <w:p>
+      <w:pPr>
+        <w:spacing w:before="160"/>
+        <w:jc w:val="both"/>
+      </w:pPr>
+      <w:r>
+        <w:drawing>
+          <wp:inline distT="0" distB="0" distL="114300" distR="114300">
+            <wp:extent cx="4686300" cy="2819400"/>
+            <wp:effectExtent l="0" t="0" r="12700" b="0"/>
+            <wp:docPr id="14" name="图片 1"/>
+            <wp:cNvGraphicFramePr>
+              <a:graphicFrameLocks xmlns:a="http://schemas.openxmlformats.org/drawingml/2006/main" noChangeAspect="1"/>
+            </wp:cNvGraphicFramePr>
+            <a:graphic xmlns:a="http://schemas.openxmlformats.org/drawingml/2006/main">
+              <a:graphicData uri="http://schemas.openxmlformats.org/drawingml/2006/picture">
+                <pic:pic xmlns:pic="http://schemas.openxmlformats.org/drawingml/2006/picture">
+                  <pic:nvPicPr>
+                    <pic:cNvPr id="14" name="图片 1"/>
+                    <pic:cNvPicPr>
+                      <a:picLocks noChangeAspect="1"/>
+                    </pic:cNvPicPr>
+                  </pic:nvPicPr>
+                  <pic:blipFill>
+                    <a:blip r:embed="rId17"/>
+                    <a:stretch>
+                      <a:fillRect/>
+                    </a:stretch>
+                  </pic:blipFill>
+                  <pic:spPr>
+                    <a:xfrm>
+                      <a:off x="0" y="0"/>
+                      <a:ext cx="4686300" cy="2819400"/>
+                    </a:xfrm>
+                    <a:prstGeom prst="rect">
+                      <a:avLst/>
+                    </a:prstGeom>
+                    <a:noFill/>
+                    <a:ln>
+                      <a:noFill/>
+                    </a:ln>
+                  </pic:spPr>
+                </pic:pic>
+              </a:graphicData>
+            </a:graphic>
+          </wp:inline>
+        </w:drawing>
+      </w:r>
+    </w:p>
+    <w:p>
+      <w:pPr>
+        <w:spacing w:before="160"/>
+        <w:jc w:val="both"/>
+      </w:pPr>
+    </w:p>
+    <w:p>
+      <w:pPr>
+        <w:keepNext w:val="0"/>
+        <w:keepLines w:val="0"/>
+        <w:widowControl/>
+        <w:suppressLineNumbers w:val="0"/>
+        <w:shd w:val="clear" w:fill="1E1E1E"/>
+        <w:spacing w:line="360" w:lineRule="atLeast"/>
+        <w:jc w:val="left"/>
+        <w:rPr>
+          <w:rFonts w:ascii="Menlo" w:hAnsi="Menlo" w:eastAsia="Menlo" w:cs="Menlo"/>
+          <w:b w:val="0"/>
+          <w:bCs w:val="0"/>
+          <w:color w:val="D4D4D4"/>
+          <w:sz w:val="24"/>
+          <w:szCs w:val="24"/>
+        </w:rPr>
+      </w:pPr>
+      <w:r>
+        <w:rPr>
+          <w:rFonts w:hint="default" w:ascii="Menlo" w:hAnsi="Menlo" w:eastAsia="Menlo" w:cs="Menlo"/>
+          <w:b w:val="0"/>
+          <w:bCs w:val="0"/>
+          <w:color w:val="6A9955"/>
+          <w:kern w:val="0"/>
+          <w:sz w:val="24"/>
+          <w:szCs w:val="24"/>
+          <w:shd w:val="clear" w:fill="1E1E1E"/>
+          <w:lang w:val="en-US" w:eastAsia="zh-CN" w:bidi="ar"/>
+        </w:rPr>
+        <w:t># prac 1</w:t>
+      </w:r>
+    </w:p>
+    <w:p>
+      <w:pPr>
+        <w:keepNext w:val="0"/>
+        <w:keepLines w:val="0"/>
+        <w:widowControl/>
+        <w:suppressLineNumbers w:val="0"/>
+        <w:shd w:val="clear" w:fill="1E1E1E"/>
+        <w:spacing w:line="360" w:lineRule="atLeast"/>
+        <w:jc w:val="left"/>
+        <w:rPr>
+          <w:rFonts w:hint="default" w:ascii="Menlo" w:hAnsi="Menlo" w:eastAsia="Menlo" w:cs="Menlo"/>
+          <w:b w:val="0"/>
+          <w:bCs w:val="0"/>
+          <w:color w:val="D4D4D4"/>
+          <w:sz w:val="24"/>
+          <w:szCs w:val="24"/>
+        </w:rPr>
+      </w:pPr>
+    </w:p>
+    <w:p>
+      <w:pPr>
+        <w:keepNext w:val="0"/>
+        <w:keepLines w:val="0"/>
+        <w:widowControl/>
+        <w:suppressLineNumbers w:val="0"/>
+        <w:shd w:val="clear" w:fill="1E1E1E"/>
+        <w:spacing w:line="360" w:lineRule="atLeast"/>
+        <w:jc w:val="left"/>
+        <w:rPr>
+          <w:rFonts w:hint="default" w:ascii="Menlo" w:hAnsi="Menlo" w:eastAsia="Menlo" w:cs="Menlo"/>
+          <w:b w:val="0"/>
+          <w:bCs w:val="0"/>
+          <w:color w:val="D4D4D4"/>
+          <w:sz w:val="24"/>
+          <w:szCs w:val="24"/>
+        </w:rPr>
+      </w:pPr>
+      <w:r>
+        <w:rPr>
+          <w:rFonts w:hint="default" w:ascii="Menlo" w:hAnsi="Menlo" w:eastAsia="Menlo" w:cs="Menlo"/>
+          <w:b w:val="0"/>
+          <w:bCs w:val="0"/>
+          <w:color w:val="569CD6"/>
+          <w:kern w:val="0"/>
+          <w:sz w:val="24"/>
+          <w:szCs w:val="24"/>
+          <w:shd w:val="clear" w:fill="1E1E1E"/>
+          <w:lang w:val="en-US" w:eastAsia="zh-CN" w:bidi="ar"/>
+        </w:rPr>
+        <w:t>FROM</w:t>
+      </w:r>
+      <w:r>
+        <w:rPr>
+          <w:rFonts w:hint="default" w:ascii="Menlo" w:hAnsi="Menlo" w:eastAsia="Menlo" w:cs="Menlo"/>
+          <w:b w:val="0"/>
+          <w:bCs w:val="0"/>
+          <w:color w:val="D4D4D4"/>
+          <w:kern w:val="0"/>
+          <w:sz w:val="24"/>
+          <w:szCs w:val="24"/>
+          <w:shd w:val="clear" w:fill="1E1E1E"/>
+          <w:lang w:val="en-US" w:eastAsia="zh-CN" w:bidi="ar"/>
+        </w:rPr>
+        <w:t xml:space="preserve"> ubuntu:24.04</w:t>
+      </w:r>
+    </w:p>
+    <w:p>
+      <w:pPr>
+        <w:keepNext w:val="0"/>
+        <w:keepLines w:val="0"/>
+        <w:widowControl/>
+        <w:suppressLineNumbers w:val="0"/>
+        <w:jc w:val="left"/>
+      </w:pPr>
+    </w:p>
+    <w:p>
+      <w:pPr>
+        <w:keepNext w:val="0"/>
+        <w:keepLines w:val="0"/>
+        <w:widowControl/>
+        <w:suppressLineNumbers w:val="0"/>
+        <w:shd w:val="clear" w:fill="1E1E1E"/>
+        <w:spacing w:line="360" w:lineRule="atLeast"/>
+        <w:jc w:val="left"/>
+        <w:rPr>
+          <w:rFonts w:hint="default" w:ascii="Menlo" w:hAnsi="Menlo" w:eastAsia="Menlo" w:cs="Menlo"/>
+          <w:b w:val="0"/>
+          <w:bCs w:val="0"/>
+          <w:color w:val="D4D4D4"/>
+          <w:sz w:val="24"/>
+          <w:szCs w:val="24"/>
+        </w:rPr>
+      </w:pPr>
+      <w:r>
+        <w:rPr>
+          <w:rFonts w:hint="default" w:ascii="Menlo" w:hAnsi="Menlo" w:eastAsia="Menlo" w:cs="Menlo"/>
+          <w:b w:val="0"/>
+          <w:bCs w:val="0"/>
+          <w:color w:val="569CD6"/>
+          <w:kern w:val="0"/>
+          <w:sz w:val="24"/>
+          <w:szCs w:val="24"/>
+          <w:shd w:val="clear" w:fill="1E1E1E"/>
+          <w:lang w:val="en-US" w:eastAsia="zh-CN" w:bidi="ar"/>
+        </w:rPr>
+        <w:t>WORKDIR</w:t>
+      </w:r>
+      <w:r>
+        <w:rPr>
+          <w:rFonts w:hint="default" w:ascii="Menlo" w:hAnsi="Menlo" w:eastAsia="Menlo" w:cs="Menlo"/>
+          <w:b w:val="0"/>
+          <w:bCs w:val="0"/>
+          <w:color w:val="D4D4D4"/>
+          <w:kern w:val="0"/>
+          <w:sz w:val="24"/>
+          <w:szCs w:val="24"/>
+          <w:shd w:val="clear" w:fill="1E1E1E"/>
+          <w:lang w:val="en-US" w:eastAsia="zh-CN" w:bidi="ar"/>
+        </w:rPr>
+        <w:t xml:space="preserve"> /project</w:t>
+      </w:r>
+    </w:p>
+    <w:p>
+      <w:pPr>
+        <w:keepNext w:val="0"/>
+        <w:keepLines w:val="0"/>
+        <w:widowControl/>
+        <w:suppressLineNumbers w:val="0"/>
+        <w:jc w:val="left"/>
+      </w:pPr>
+    </w:p>
+    <w:p>
+      <w:pPr>
+        <w:keepNext w:val="0"/>
+        <w:keepLines w:val="0"/>
+        <w:widowControl/>
+        <w:suppressLineNumbers w:val="0"/>
+        <w:shd w:val="clear" w:fill="1E1E1E"/>
+        <w:spacing w:line="360" w:lineRule="atLeast"/>
+        <w:jc w:val="left"/>
+        <w:rPr>
+          <w:rFonts w:hint="default" w:ascii="Menlo" w:hAnsi="Menlo" w:eastAsia="Menlo" w:cs="Menlo"/>
+          <w:b w:val="0"/>
+          <w:bCs w:val="0"/>
+          <w:color w:val="D4D4D4"/>
+          <w:sz w:val="24"/>
+          <w:szCs w:val="24"/>
+        </w:rPr>
+      </w:pPr>
+      <w:r>
+        <w:rPr>
+          <w:rFonts w:hint="default" w:ascii="Menlo" w:hAnsi="Menlo" w:eastAsia="Menlo" w:cs="Menlo"/>
+          <w:b w:val="0"/>
+          <w:bCs w:val="0"/>
+          <w:color w:val="569CD6"/>
+          <w:kern w:val="0"/>
+          <w:sz w:val="24"/>
+          <w:szCs w:val="24"/>
+          <w:shd w:val="clear" w:fill="1E1E1E"/>
+          <w:lang w:val="en-US" w:eastAsia="zh-CN" w:bidi="ar"/>
+        </w:rPr>
+        <w:t>CMD</w:t>
+      </w:r>
+      <w:r>
+        <w:rPr>
+          <w:rFonts w:hint="default" w:ascii="Menlo" w:hAnsi="Menlo" w:eastAsia="Menlo" w:cs="Menlo"/>
+          <w:b w:val="0"/>
+          <w:bCs w:val="0"/>
+          <w:color w:val="D4D4D4"/>
+          <w:kern w:val="0"/>
+          <w:sz w:val="24"/>
+          <w:szCs w:val="24"/>
+          <w:shd w:val="clear" w:fill="1E1E1E"/>
+          <w:lang w:val="en-US" w:eastAsia="zh-CN" w:bidi="ar"/>
+        </w:rPr>
+        <w:t xml:space="preserve"> [</w:t>
+      </w:r>
+      <w:r>
+        <w:rPr>
+          <w:rFonts w:hint="default" w:ascii="Menlo" w:hAnsi="Menlo" w:eastAsia="Menlo" w:cs="Menlo"/>
+          <w:b w:val="0"/>
+          <w:bCs w:val="0"/>
+          <w:color w:val="CE9178"/>
+          <w:kern w:val="0"/>
+          <w:sz w:val="24"/>
+          <w:szCs w:val="24"/>
+          <w:shd w:val="clear" w:fill="1E1E1E"/>
+          <w:lang w:val="en-US" w:eastAsia="zh-CN" w:bidi="ar"/>
+        </w:rPr>
+        <w:t>"/bin/bash"</w:t>
+      </w:r>
+      <w:r>
+        <w:rPr>
+          <w:rFonts w:hint="default" w:ascii="Menlo" w:hAnsi="Menlo" w:eastAsia="Menlo" w:cs="Menlo"/>
+          <w:b w:val="0"/>
+          <w:bCs w:val="0"/>
+          <w:color w:val="D4D4D4"/>
+          <w:kern w:val="0"/>
+          <w:sz w:val="24"/>
+          <w:szCs w:val="24"/>
+          <w:shd w:val="clear" w:fill="1E1E1E"/>
+          <w:lang w:val="en-US" w:eastAsia="zh-CN" w:bidi="ar"/>
+        </w:rPr>
+        <w:t>]</w:t>
+      </w:r>
+    </w:p>
+    <w:p>
+      <w:pPr>
+        <w:keepNext w:val="0"/>
+        <w:keepLines w:val="0"/>
+        <w:widowControl/>
+        <w:suppressLineNumbers w:val="0"/>
+        <w:jc w:val="left"/>
+      </w:pPr>
+    </w:p>
+    <w:p>
+      <w:pPr>
+        <w:keepNext w:val="0"/>
+        <w:keepLines w:val="0"/>
+        <w:widowControl/>
+        <w:suppressLineNumbers w:val="0"/>
+        <w:shd w:val="clear" w:fill="1E1E1E"/>
+        <w:spacing w:line="360" w:lineRule="atLeast"/>
+        <w:jc w:val="left"/>
+        <w:rPr>
+          <w:rFonts w:hint="default" w:ascii="Menlo" w:hAnsi="Menlo" w:eastAsia="Menlo" w:cs="Menlo"/>
+          <w:b w:val="0"/>
+          <w:bCs w:val="0"/>
+          <w:color w:val="D4D4D4"/>
+          <w:sz w:val="24"/>
+          <w:szCs w:val="24"/>
+        </w:rPr>
+      </w:pPr>
+      <w:r>
+        <w:rPr>
+          <w:rFonts w:hint="default" w:ascii="Menlo" w:hAnsi="Menlo" w:eastAsia="Menlo" w:cs="Menlo"/>
+          <w:b w:val="0"/>
+          <w:bCs w:val="0"/>
+          <w:color w:val="6A9955"/>
+          <w:kern w:val="0"/>
+          <w:sz w:val="24"/>
+          <w:szCs w:val="24"/>
+          <w:shd w:val="clear" w:fill="1E1E1E"/>
+          <w:lang w:val="en-US" w:eastAsia="zh-CN" w:bidi="ar"/>
+        </w:rPr>
+        <w:t># docker build -t prac1-ubuntu:24.04 .</w:t>
+      </w:r>
+    </w:p>
+    <w:p>
+      <w:pPr>
+        <w:keepNext w:val="0"/>
+        <w:keepLines w:val="0"/>
+        <w:widowControl/>
+        <w:suppressLineNumbers w:val="0"/>
+        <w:jc w:val="left"/>
+      </w:pPr>
+    </w:p>
+    <w:p>
+      <w:pPr>
+        <w:keepNext w:val="0"/>
+        <w:keepLines w:val="0"/>
+        <w:widowControl/>
+        <w:suppressLineNumbers w:val="0"/>
+        <w:shd w:val="clear" w:fill="1E1E1E"/>
+        <w:spacing w:line="360" w:lineRule="atLeast"/>
+        <w:jc w:val="left"/>
+        <w:rPr>
+          <w:rFonts w:hint="default" w:ascii="Menlo" w:hAnsi="Menlo" w:eastAsia="Menlo" w:cs="Menlo"/>
+          <w:b w:val="0"/>
+          <w:bCs w:val="0"/>
+          <w:color w:val="D4D4D4"/>
+          <w:sz w:val="24"/>
+          <w:szCs w:val="24"/>
+        </w:rPr>
+      </w:pPr>
+      <w:r>
+        <w:rPr>
+          <w:rFonts w:hint="default" w:ascii="Menlo" w:hAnsi="Menlo" w:eastAsia="Menlo" w:cs="Menlo"/>
+          <w:b w:val="0"/>
+          <w:bCs w:val="0"/>
+          <w:color w:val="6A9955"/>
+          <w:kern w:val="0"/>
+          <w:sz w:val="24"/>
+          <w:szCs w:val="24"/>
+          <w:shd w:val="clear" w:fill="1E1E1E"/>
+          <w:lang w:val="en-US" w:eastAsia="zh-CN" w:bidi="ar"/>
+        </w:rPr>
+        <w:t># docker run -it prac1-ubuntu:24.04</w:t>
+      </w:r>
+    </w:p>
+    <w:p>
+      <w:pPr>
+        <w:keepNext w:val="0"/>
+        <w:keepLines w:val="0"/>
+        <w:widowControl/>
+        <w:suppressLineNumbers w:val="0"/>
+        <w:jc w:val="left"/>
+      </w:pPr>
+    </w:p>
+    <w:p>
+      <w:pPr>
+        <w:keepNext w:val="0"/>
+        <w:keepLines w:val="0"/>
+        <w:widowControl/>
+        <w:suppressLineNumbers w:val="0"/>
+        <w:shd w:val="clear" w:fill="1E1E1E"/>
+        <w:spacing w:line="360" w:lineRule="atLeast"/>
+        <w:jc w:val="left"/>
+        <w:rPr>
+          <w:rFonts w:hint="default" w:ascii="Menlo" w:hAnsi="Menlo" w:eastAsia="Menlo" w:cs="Menlo"/>
+          <w:b w:val="0"/>
+          <w:bCs w:val="0"/>
+          <w:color w:val="D4D4D4"/>
+          <w:sz w:val="24"/>
+          <w:szCs w:val="24"/>
+        </w:rPr>
+      </w:pPr>
+      <w:r>
+        <w:rPr>
+          <w:rFonts w:hint="default" w:ascii="Menlo" w:hAnsi="Menlo" w:eastAsia="Menlo" w:cs="Menlo"/>
+          <w:b w:val="0"/>
+          <w:bCs w:val="0"/>
+          <w:color w:val="6A9955"/>
+          <w:kern w:val="0"/>
+          <w:sz w:val="24"/>
+          <w:szCs w:val="24"/>
+          <w:shd w:val="clear" w:fill="1E1E1E"/>
+          <w:lang w:val="en-US" w:eastAsia="zh-CN" w:bidi="ar"/>
+        </w:rPr>
+        <w:t># prac 2</w:t>
+      </w:r>
+    </w:p>
+    <w:p>
+      <w:pPr>
+        <w:keepNext w:val="0"/>
+        <w:keepLines w:val="0"/>
+        <w:widowControl/>
+        <w:suppressLineNumbers w:val="0"/>
+        <w:shd w:val="clear" w:fill="1E1E1E"/>
+        <w:spacing w:line="360" w:lineRule="atLeast"/>
+        <w:jc w:val="left"/>
+        <w:rPr>
+          <w:rFonts w:hint="default" w:ascii="Menlo" w:hAnsi="Menlo" w:eastAsia="Menlo" w:cs="Menlo"/>
+          <w:b w:val="0"/>
+          <w:bCs w:val="0"/>
+          <w:color w:val="D4D4D4"/>
+          <w:sz w:val="24"/>
+          <w:szCs w:val="24"/>
+        </w:rPr>
+      </w:pPr>
+      <w:r>
+        <w:rPr>
+          <w:rFonts w:hint="default" w:ascii="Menlo" w:hAnsi="Menlo" w:eastAsia="Menlo" w:cs="Menlo"/>
+          <w:b w:val="0"/>
+          <w:bCs w:val="0"/>
+          <w:color w:val="569CD6"/>
+          <w:kern w:val="0"/>
+          <w:sz w:val="24"/>
+          <w:szCs w:val="24"/>
+          <w:shd w:val="clear" w:fill="1E1E1E"/>
+          <w:lang w:val="en-US" w:eastAsia="zh-CN" w:bidi="ar"/>
+        </w:rPr>
+        <w:t>FROM</w:t>
+      </w:r>
+      <w:r>
+        <w:rPr>
+          <w:rFonts w:hint="default" w:ascii="Menlo" w:hAnsi="Menlo" w:eastAsia="Menlo" w:cs="Menlo"/>
+          <w:b w:val="0"/>
+          <w:bCs w:val="0"/>
+          <w:color w:val="D4D4D4"/>
+          <w:kern w:val="0"/>
+          <w:sz w:val="24"/>
+          <w:szCs w:val="24"/>
+          <w:shd w:val="clear" w:fill="1E1E1E"/>
+          <w:lang w:val="en-US" w:eastAsia="zh-CN" w:bidi="ar"/>
+        </w:rPr>
+        <w:t xml:space="preserve"> ubuntu:24.04</w:t>
+      </w:r>
+    </w:p>
+    <w:p>
+      <w:pPr>
+        <w:keepNext w:val="0"/>
+        <w:keepLines w:val="0"/>
+        <w:widowControl/>
+        <w:suppressLineNumbers w:val="0"/>
+        <w:jc w:val="left"/>
+      </w:pPr>
+    </w:p>
+    <w:p>
+      <w:pPr>
+        <w:keepNext w:val="0"/>
+        <w:keepLines w:val="0"/>
+        <w:widowControl/>
+        <w:suppressLineNumbers w:val="0"/>
+        <w:shd w:val="clear" w:fill="1E1E1E"/>
+        <w:spacing w:line="360" w:lineRule="atLeast"/>
+        <w:jc w:val="left"/>
+        <w:rPr>
+          <w:rFonts w:hint="default" w:ascii="Menlo" w:hAnsi="Menlo" w:eastAsia="Menlo" w:cs="Menlo"/>
+          <w:b w:val="0"/>
+          <w:bCs w:val="0"/>
+          <w:color w:val="D4D4D4"/>
+          <w:sz w:val="24"/>
+          <w:szCs w:val="24"/>
+        </w:rPr>
+      </w:pPr>
+      <w:r>
+        <w:rPr>
+          <w:rFonts w:hint="default" w:ascii="Menlo" w:hAnsi="Menlo" w:eastAsia="Menlo" w:cs="Menlo"/>
+          <w:b w:val="0"/>
+          <w:bCs w:val="0"/>
+          <w:color w:val="569CD6"/>
+          <w:kern w:val="0"/>
+          <w:sz w:val="24"/>
+          <w:szCs w:val="24"/>
+          <w:shd w:val="clear" w:fill="1E1E1E"/>
+          <w:lang w:val="en-US" w:eastAsia="zh-CN" w:bidi="ar"/>
+        </w:rPr>
+        <w:t>RUN</w:t>
+      </w:r>
+      <w:r>
+        <w:rPr>
+          <w:rFonts w:hint="default" w:ascii="Menlo" w:hAnsi="Menlo" w:eastAsia="Menlo" w:cs="Menlo"/>
+          <w:b w:val="0"/>
+          <w:bCs w:val="0"/>
+          <w:color w:val="D4D4D4"/>
+          <w:kern w:val="0"/>
+          <w:sz w:val="24"/>
+          <w:szCs w:val="24"/>
+          <w:shd w:val="clear" w:fill="1E1E1E"/>
+          <w:lang w:val="en-US" w:eastAsia="zh-CN" w:bidi="ar"/>
+        </w:rPr>
+        <w:t xml:space="preserve"> apt-get update &amp;&amp; \</w:t>
+      </w:r>
+    </w:p>
+    <w:p>
+      <w:pPr>
+        <w:keepNext w:val="0"/>
+        <w:keepLines w:val="0"/>
+        <w:widowControl/>
+        <w:suppressLineNumbers w:val="0"/>
+        <w:shd w:val="clear" w:fill="1E1E1E"/>
+        <w:spacing w:line="360" w:lineRule="atLeast"/>
+        <w:jc w:val="left"/>
+        <w:rPr>
+          <w:rFonts w:hint="default" w:ascii="Menlo" w:hAnsi="Menlo" w:eastAsia="Menlo" w:cs="Menlo"/>
+          <w:b w:val="0"/>
+          <w:bCs w:val="0"/>
+          <w:color w:val="D4D4D4"/>
+          <w:sz w:val="24"/>
+          <w:szCs w:val="24"/>
+        </w:rPr>
+      </w:pPr>
+      <w:r>
+        <w:rPr>
+          <w:rFonts w:hint="default" w:ascii="Menlo" w:hAnsi="Menlo" w:eastAsia="Menlo" w:cs="Menlo"/>
+          <w:b w:val="0"/>
+          <w:bCs w:val="0"/>
+          <w:color w:val="D4D4D4"/>
+          <w:kern w:val="0"/>
+          <w:sz w:val="24"/>
+          <w:szCs w:val="24"/>
+          <w:shd w:val="clear" w:fill="1E1E1E"/>
+          <w:lang w:val="en-US" w:eastAsia="zh-CN" w:bidi="ar"/>
+        </w:rPr>
+        <w:t>apt-get install -y curl &amp;&amp; \</w:t>
+      </w:r>
+    </w:p>
+    <w:p>
+      <w:pPr>
+        <w:keepNext w:val="0"/>
+        <w:keepLines w:val="0"/>
+        <w:widowControl/>
+        <w:suppressLineNumbers w:val="0"/>
+        <w:shd w:val="clear" w:fill="1E1E1E"/>
+        <w:spacing w:line="360" w:lineRule="atLeast"/>
+        <w:jc w:val="left"/>
+        <w:rPr>
+          <w:rFonts w:hint="default" w:ascii="Menlo" w:hAnsi="Menlo" w:eastAsia="Menlo" w:cs="Menlo"/>
+          <w:b w:val="0"/>
+          <w:bCs w:val="0"/>
+          <w:color w:val="D4D4D4"/>
+          <w:sz w:val="24"/>
+          <w:szCs w:val="24"/>
+        </w:rPr>
+      </w:pPr>
+      <w:r>
+        <w:rPr>
+          <w:rFonts w:hint="default" w:ascii="Menlo" w:hAnsi="Menlo" w:eastAsia="Menlo" w:cs="Menlo"/>
+          <w:b w:val="0"/>
+          <w:bCs w:val="0"/>
+          <w:color w:val="D4D4D4"/>
+          <w:kern w:val="0"/>
+          <w:sz w:val="24"/>
+          <w:szCs w:val="24"/>
+          <w:shd w:val="clear" w:fill="1E1E1E"/>
+          <w:lang w:val="en-US" w:eastAsia="zh-CN" w:bidi="ar"/>
+        </w:rPr>
+        <w:t>rm -rf /var/lib/apt/lists/*</w:t>
+      </w:r>
+    </w:p>
+    <w:p>
+      <w:pPr>
+        <w:keepNext w:val="0"/>
+        <w:keepLines w:val="0"/>
+        <w:widowControl/>
+        <w:suppressLineNumbers w:val="0"/>
+        <w:jc w:val="left"/>
+      </w:pPr>
+    </w:p>
+    <w:p>
+      <w:pPr>
+        <w:keepNext w:val="0"/>
+        <w:keepLines w:val="0"/>
+        <w:widowControl/>
+        <w:suppressLineNumbers w:val="0"/>
+        <w:shd w:val="clear" w:fill="1E1E1E"/>
+        <w:spacing w:line="360" w:lineRule="atLeast"/>
+        <w:jc w:val="left"/>
+        <w:rPr>
+          <w:rFonts w:hint="default" w:ascii="Menlo" w:hAnsi="Menlo" w:eastAsia="Menlo" w:cs="Menlo"/>
+          <w:b w:val="0"/>
+          <w:bCs w:val="0"/>
+          <w:color w:val="D4D4D4"/>
+          <w:sz w:val="24"/>
+          <w:szCs w:val="24"/>
+        </w:rPr>
+      </w:pPr>
+      <w:r>
+        <w:rPr>
+          <w:rFonts w:hint="default" w:ascii="Menlo" w:hAnsi="Menlo" w:eastAsia="Menlo" w:cs="Menlo"/>
+          <w:b w:val="0"/>
+          <w:bCs w:val="0"/>
+          <w:color w:val="569CD6"/>
+          <w:kern w:val="0"/>
+          <w:sz w:val="24"/>
+          <w:szCs w:val="24"/>
+          <w:shd w:val="clear" w:fill="1E1E1E"/>
+          <w:lang w:val="en-US" w:eastAsia="zh-CN" w:bidi="ar"/>
+        </w:rPr>
+        <w:t>WORKDIR</w:t>
+      </w:r>
+      <w:r>
+        <w:rPr>
+          <w:rFonts w:hint="default" w:ascii="Menlo" w:hAnsi="Menlo" w:eastAsia="Menlo" w:cs="Menlo"/>
+          <w:b w:val="0"/>
+          <w:bCs w:val="0"/>
+          <w:color w:val="D4D4D4"/>
+          <w:kern w:val="0"/>
+          <w:sz w:val="24"/>
+          <w:szCs w:val="24"/>
+          <w:shd w:val="clear" w:fill="1E1E1E"/>
+          <w:lang w:val="en-US" w:eastAsia="zh-CN" w:bidi="ar"/>
+        </w:rPr>
+        <w:t xml:space="preserve"> /data</w:t>
+      </w:r>
+    </w:p>
+    <w:p>
+      <w:pPr>
+        <w:keepNext w:val="0"/>
+        <w:keepLines w:val="0"/>
+        <w:widowControl/>
+        <w:suppressLineNumbers w:val="0"/>
+        <w:jc w:val="left"/>
+      </w:pPr>
+    </w:p>
+    <w:p>
+      <w:pPr>
+        <w:keepNext w:val="0"/>
+        <w:keepLines w:val="0"/>
+        <w:widowControl/>
+        <w:suppressLineNumbers w:val="0"/>
+        <w:shd w:val="clear" w:fill="1E1E1E"/>
+        <w:spacing w:line="360" w:lineRule="atLeast"/>
+        <w:jc w:val="left"/>
+        <w:rPr>
+          <w:rFonts w:hint="default" w:ascii="Menlo" w:hAnsi="Menlo" w:eastAsia="Menlo" w:cs="Menlo"/>
+          <w:b w:val="0"/>
+          <w:bCs w:val="0"/>
+          <w:color w:val="D4D4D4"/>
+          <w:sz w:val="24"/>
+          <w:szCs w:val="24"/>
+        </w:rPr>
+      </w:pPr>
+      <w:r>
+        <w:rPr>
+          <w:rFonts w:hint="default" w:ascii="Menlo" w:hAnsi="Menlo" w:eastAsia="Menlo" w:cs="Menlo"/>
+          <w:b w:val="0"/>
+          <w:bCs w:val="0"/>
+          <w:color w:val="569CD6"/>
+          <w:kern w:val="0"/>
+          <w:sz w:val="24"/>
+          <w:szCs w:val="24"/>
+          <w:shd w:val="clear" w:fill="1E1E1E"/>
+          <w:lang w:val="en-US" w:eastAsia="zh-CN" w:bidi="ar"/>
+        </w:rPr>
+        <w:t>COPY</w:t>
+      </w:r>
+      <w:r>
+        <w:rPr>
+          <w:rFonts w:hint="default" w:ascii="Menlo" w:hAnsi="Menlo" w:eastAsia="Menlo" w:cs="Menlo"/>
+          <w:b w:val="0"/>
+          <w:bCs w:val="0"/>
+          <w:color w:val="D4D4D4"/>
+          <w:kern w:val="0"/>
+          <w:sz w:val="24"/>
+          <w:szCs w:val="24"/>
+          <w:shd w:val="clear" w:fill="1E1E1E"/>
+          <w:lang w:val="en-US" w:eastAsia="zh-CN" w:bidi="ar"/>
+        </w:rPr>
+        <w:t xml:space="preserve"> message.txt /data/</w:t>
+      </w:r>
+    </w:p>
+    <w:p>
+      <w:pPr>
+        <w:keepNext w:val="0"/>
+        <w:keepLines w:val="0"/>
+        <w:widowControl/>
+        <w:suppressLineNumbers w:val="0"/>
+        <w:jc w:val="left"/>
+      </w:pPr>
+    </w:p>
+    <w:p>
+      <w:pPr>
+        <w:keepNext w:val="0"/>
+        <w:keepLines w:val="0"/>
+        <w:widowControl/>
+        <w:suppressLineNumbers w:val="0"/>
+        <w:shd w:val="clear" w:fill="1E1E1E"/>
+        <w:spacing w:line="360" w:lineRule="atLeast"/>
+        <w:jc w:val="left"/>
+        <w:rPr>
+          <w:rFonts w:hint="default" w:ascii="Menlo" w:hAnsi="Menlo" w:eastAsia="Menlo" w:cs="Menlo"/>
+          <w:b w:val="0"/>
+          <w:bCs w:val="0"/>
+          <w:color w:val="D4D4D4"/>
+          <w:sz w:val="24"/>
+          <w:szCs w:val="24"/>
+        </w:rPr>
+      </w:pPr>
+      <w:r>
+        <w:rPr>
+          <w:rFonts w:hint="default" w:ascii="Menlo" w:hAnsi="Menlo" w:eastAsia="Menlo" w:cs="Menlo"/>
+          <w:b w:val="0"/>
+          <w:bCs w:val="0"/>
+          <w:color w:val="569CD6"/>
+          <w:kern w:val="0"/>
+          <w:sz w:val="24"/>
+          <w:szCs w:val="24"/>
+          <w:shd w:val="clear" w:fill="1E1E1E"/>
+          <w:lang w:val="en-US" w:eastAsia="zh-CN" w:bidi="ar"/>
+        </w:rPr>
+        <w:t>CMD</w:t>
+      </w:r>
+      <w:r>
+        <w:rPr>
+          <w:rFonts w:hint="default" w:ascii="Menlo" w:hAnsi="Menlo" w:eastAsia="Menlo" w:cs="Menlo"/>
+          <w:b w:val="0"/>
+          <w:bCs w:val="0"/>
+          <w:color w:val="D4D4D4"/>
+          <w:kern w:val="0"/>
+          <w:sz w:val="24"/>
+          <w:szCs w:val="24"/>
+          <w:shd w:val="clear" w:fill="1E1E1E"/>
+          <w:lang w:val="en-US" w:eastAsia="zh-CN" w:bidi="ar"/>
+        </w:rPr>
+        <w:t xml:space="preserve"> [</w:t>
+      </w:r>
+      <w:r>
+        <w:rPr>
+          <w:rFonts w:hint="default" w:ascii="Menlo" w:hAnsi="Menlo" w:eastAsia="Menlo" w:cs="Menlo"/>
+          <w:b w:val="0"/>
+          <w:bCs w:val="0"/>
+          <w:color w:val="CE9178"/>
+          <w:kern w:val="0"/>
+          <w:sz w:val="24"/>
+          <w:szCs w:val="24"/>
+          <w:shd w:val="clear" w:fill="1E1E1E"/>
+          <w:lang w:val="en-US" w:eastAsia="zh-CN" w:bidi="ar"/>
+        </w:rPr>
+        <w:t>"/bin/bash/data"</w:t>
+      </w:r>
+      <w:r>
+        <w:rPr>
+          <w:rFonts w:hint="default" w:ascii="Menlo" w:hAnsi="Menlo" w:eastAsia="Menlo" w:cs="Menlo"/>
+          <w:b w:val="0"/>
+          <w:bCs w:val="0"/>
+          <w:color w:val="D4D4D4"/>
+          <w:kern w:val="0"/>
+          <w:sz w:val="24"/>
+          <w:szCs w:val="24"/>
+          <w:shd w:val="clear" w:fill="1E1E1E"/>
+          <w:lang w:val="en-US" w:eastAsia="zh-CN" w:bidi="ar"/>
+        </w:rPr>
+        <w:t>]</w:t>
+      </w:r>
+    </w:p>
+    <w:p>
+      <w:pPr>
+        <w:spacing w:before="160"/>
+        <w:jc w:val="both"/>
+        <w:rPr>
+          <w:rFonts w:hint="default"/>
+          <w:lang w:val="en-US"/>
+        </w:rPr>
+      </w:pPr>
     </w:p>
     <w:p>
       <w:pPr>
         <w:spacing w:before="160"/>
         <w:jc w:val="center"/>
         <w:rPr>
-          <w:rFonts w:hint="default"/>
-          <w:color w:val="558ED5" w:themeColor="text2" w:themeTint="99"/>
-          <w:lang w:val="en-US"/>
-          <w14:textFill>
-            <w14:solidFill>
-              <w14:schemeClr w14:val="tx2">
-                <w14:lumMod w14:val="60000"/>
-                <w14:lumOff w14:val="40000"/>
-              </w14:schemeClr>
-            </w14:solidFill>
-          </w14:textFill>
+          <w:rFonts w:ascii="Calibri" w:hAnsi="Calibri" w:eastAsia="Calibri" w:cs="Calibri"/>
+          <w:i/>
+          <w:iCs/>
+          <w:color w:val="AABBD4"/>
+          <w:sz w:val="18"/>
+          <w:szCs w:val="18"/>
         </w:rPr>
       </w:pPr>
     </w:p>
@@ -10415,6 +11593,20 @@
       <w:pPr>
         <w:spacing w:before="160"/>
         <w:jc w:val="center"/>
+        <w:rPr>
+          <w:rFonts w:ascii="Calibri" w:hAnsi="Calibri" w:eastAsia="Calibri" w:cs="Calibri"/>
+          <w:i/>
+          <w:iCs/>
+          <w:color w:val="AABBD4"/>
+          <w:sz w:val="18"/>
+          <w:szCs w:val="18"/>
+        </w:rPr>
+      </w:pPr>
+    </w:p>
+    <w:p>
+      <w:pPr>
+        <w:spacing w:before="160"/>
+        <w:jc w:val="both"/>
       </w:pPr>
       <w:r>
         <w:rPr>

</xml_diff>